<commit_message>
Bid bond letter: keep only the wording and tables
Removes the company logo and the "Classification: Secret" /
"2016 ITC- Confidential" footers from the request letter template, so
every company's letter is the plain text and tables with no branding.

Co-Authored-By: Claude Opus 5.5 <noreply@anthropic.com>
Claude-Session: https://claude.ai/code/session_01SvxuiQSpKjFTPW5kaRAtUF
</commit_message>
<xml_diff>
--- a/backend/app/templates/bid_bond_request.docx
+++ b/backend/app/templates/bid_bond_request.docx
@@ -16,48 +16,6 @@
         <w:rPr>
           <w:rtl w:val="0"/>
         </w:rPr>
-      </w:r>
-      <w:r>
-        <w:drawing>
-          <wp:anchor allowOverlap="1" behindDoc="0" distB="0" distT="0" distL="114300" distR="114300" hidden="0" layoutInCell="1" locked="0" relativeHeight="0" simplePos="0">
-            <wp:simplePos x="0" y="0"/>
-            <wp:positionH relativeFrom="column">
-              <wp:posOffset>4578350</wp:posOffset>
-            </wp:positionH>
-            <wp:positionV relativeFrom="paragraph">
-              <wp:posOffset>-570229</wp:posOffset>
-            </wp:positionV>
-            <wp:extent cx="908050" cy="838200"/>
-            <wp:effectExtent b="0" l="0" r="0" t="0"/>
-            <wp:wrapNone/>
-            <wp:docPr descr="C:\Users\a.alessa\Desktop\logo.jpg" id="1" name="image1.png"/>
-            <a:graphic>
-              <a:graphicData uri="http://schemas.openxmlformats.org/drawingml/2006/picture">
-                <pic:pic>
-                  <pic:nvPicPr>
-                    <pic:cNvPr descr="C:\Users\a.alessa\Desktop\logo.jpg" id="0" name="image1.png"/>
-                    <pic:cNvPicPr preferRelativeResize="0"/>
-                  </pic:nvPicPr>
-                  <pic:blipFill>
-                    <a:blip r:embed="rId6"/>
-                    <a:srcRect b="0" l="0" r="0" t="0"/>
-                    <a:stretch>
-                      <a:fillRect/>
-                    </a:stretch>
-                  </pic:blipFill>
-                  <pic:spPr>
-                    <a:xfrm>
-                      <a:off x="0" y="0"/>
-                      <a:ext cx="908050" cy="838200"/>
-                    </a:xfrm>
-                    <a:prstGeom prst="rect"/>
-                    <a:ln/>
-                  </pic:spPr>
-                </pic:pic>
-              </a:graphicData>
-            </a:graphic>
-          </wp:anchor>
-        </w:drawing>
       </w:r>
     </w:p>
     <w:p>
@@ -1076,68 +1034,6 @@
         <w:vertAlign w:val="baseline"/>
       </w:rPr>
     </w:pPr>
-    <w:r>
-      <w:rPr>
-        <w:rFonts w:ascii="Arial" w:cs="Arial" w:eastAsia="Arial" w:hAnsi="Arial"/>
-        <w:b w:val="1"/>
-        <w:bCs w:val="1"/>
-        <w:i w:val="0"/>
-        <w:iCs w:val="0"/>
-        <w:smallCaps w:val="0"/>
-        <w:strike w:val="0"/>
-        <w:color w:val="000000"/>
-        <w:sz w:val="22"/>
-        <w:szCs w:val="22"/>
-        <w:u w:val="none"/>
-        <w:shd w:fill="auto" w:val="clear"/>
-        <w:vertAlign w:val="baseline"/>
-        <w:rtl w:val="0"/>
-      </w:rPr>
-      <w:t xml:space="preserve">Classification:</w:t>
-    </w:r>
-    <w:r>
-      <w:rPr>
-        <w:rFonts w:ascii="Arial" w:cs="Arial" w:eastAsia="Arial" w:hAnsi="Arial"/>
-        <w:b w:val="0"/>
-        <w:bCs w:val="0"/>
-        <w:i w:val="0"/>
-        <w:iCs w:val="0"/>
-        <w:smallCaps w:val="0"/>
-        <w:strike w:val="0"/>
-        <w:color w:val="000000"/>
-        <w:sz w:val="22"/>
-        <w:szCs w:val="22"/>
-        <w:u w:val="none"/>
-        <w:shd w:fill="auto" w:val="clear"/>
-        <w:vertAlign w:val="baseline"/>
-        <w:rtl w:val="0"/>
-      </w:rPr>
-      <w:t xml:space="preserve"> </w:t>
-    </w:r>
-    <w:r>
-      <w:rPr>
-        <w:rFonts w:ascii="Arial" w:cs="Arial" w:eastAsia="Arial" w:hAnsi="Arial"/>
-        <w:b w:val="1"/>
-        <w:bCs w:val="1"/>
-        <w:i w:val="0"/>
-        <w:iCs w:val="0"/>
-        <w:smallCaps w:val="0"/>
-        <w:strike w:val="0"/>
-        <w:color w:val="0062b1"/>
-        <w:sz w:val="22"/>
-        <w:szCs w:val="22"/>
-        <w:u w:val="none"/>
-        <w:shd w:fill="auto" w:val="clear"/>
-        <w:vertAlign w:val="baseline"/>
-        <w:rtl w:val="0"/>
-      </w:rPr>
-      <w:t xml:space="preserve">Secret</w:t>
-    </w:r>
-    <w:r>
-      <w:rPr>
-        <w:rtl w:val="0"/>
-      </w:rPr>
-    </w:r>
   </w:p>
 </w:ftr>
 </file>
@@ -1181,25 +1077,6 @@
         <w:vertAlign w:val="baseline"/>
       </w:rPr>
     </w:pPr>
-    <w:r>
-      <w:rPr>
-        <w:rFonts w:ascii="Times New Roman" w:cs="Times New Roman" w:eastAsia="Times New Roman" w:hAnsi="Times New Roman"/>
-        <w:b w:val="0"/>
-        <w:bCs w:val="0"/>
-        <w:i w:val="0"/>
-        <w:iCs w:val="0"/>
-        <w:smallCaps w:val="0"/>
-        <w:strike w:val="0"/>
-        <w:color w:val="000000"/>
-        <w:sz w:val="24"/>
-        <w:szCs w:val="24"/>
-        <w:u w:val="none"/>
-        <w:shd w:fill="auto" w:val="clear"/>
-        <w:vertAlign w:val="baseline"/>
-        <w:rtl w:val="0"/>
-      </w:rPr>
-      <w:t xml:space="preserve">2016 ITC- Confidential</w:t>
-    </w:r>
   </w:p>
 </w:ftr>
 </file>
@@ -1243,68 +1120,6 @@
         <w:vertAlign w:val="baseline"/>
       </w:rPr>
     </w:pPr>
-    <w:r>
-      <w:rPr>
-        <w:rFonts w:ascii="Arial" w:cs="Arial" w:eastAsia="Arial" w:hAnsi="Arial"/>
-        <w:b w:val="1"/>
-        <w:bCs w:val="1"/>
-        <w:i w:val="0"/>
-        <w:iCs w:val="0"/>
-        <w:smallCaps w:val="0"/>
-        <w:strike w:val="0"/>
-        <w:color w:val="000000"/>
-        <w:sz w:val="22"/>
-        <w:szCs w:val="22"/>
-        <w:u w:val="none"/>
-        <w:shd w:fill="auto" w:val="clear"/>
-        <w:vertAlign w:val="baseline"/>
-        <w:rtl w:val="0"/>
-      </w:rPr>
-      <w:t xml:space="preserve">Classification:</w:t>
-    </w:r>
-    <w:r>
-      <w:rPr>
-        <w:rFonts w:ascii="Arial" w:cs="Arial" w:eastAsia="Arial" w:hAnsi="Arial"/>
-        <w:b w:val="0"/>
-        <w:bCs w:val="0"/>
-        <w:i w:val="0"/>
-        <w:iCs w:val="0"/>
-        <w:smallCaps w:val="0"/>
-        <w:strike w:val="0"/>
-        <w:color w:val="000000"/>
-        <w:sz w:val="22"/>
-        <w:szCs w:val="22"/>
-        <w:u w:val="none"/>
-        <w:shd w:fill="auto" w:val="clear"/>
-        <w:vertAlign w:val="baseline"/>
-        <w:rtl w:val="0"/>
-      </w:rPr>
-      <w:t xml:space="preserve"> </w:t>
-    </w:r>
-    <w:r>
-      <w:rPr>
-        <w:rFonts w:ascii="Arial" w:cs="Arial" w:eastAsia="Arial" w:hAnsi="Arial"/>
-        <w:b w:val="1"/>
-        <w:bCs w:val="1"/>
-        <w:i w:val="0"/>
-        <w:iCs w:val="0"/>
-        <w:smallCaps w:val="0"/>
-        <w:strike w:val="0"/>
-        <w:color w:val="0062b1"/>
-        <w:sz w:val="22"/>
-        <w:szCs w:val="22"/>
-        <w:u w:val="none"/>
-        <w:shd w:fill="auto" w:val="clear"/>
-        <w:vertAlign w:val="baseline"/>
-        <w:rtl w:val="0"/>
-      </w:rPr>
-      <w:t xml:space="preserve">Secret</w:t>
-    </w:r>
-    <w:r>
-      <w:rPr>
-        <w:rtl w:val="0"/>
-      </w:rPr>
-    </w:r>
   </w:p>
 </w:ftr>
 </file>

</xml_diff>